<commit_message>
Rename exams and assessments folders to exam and assessment
</commit_message>
<xml_diff>
--- a/docs/Server_Access_Guide.docx
+++ b/docs/Server_Access_Guide.docx
@@ -225,7 +225,7 @@
         <w:spacing w:after="160"/>
       </w:pPr>
       <w:r>
-        <w:t xml:space="preserve">That uploads a local folder called my-project into your workshops folder. Swap workshops for exams or assessments depending on what you're uploading — see the table below.</w:t>
+        <w:t xml:space="preserve">That uploads a local folder called my-project into your workshops folder. Swap workshops for exam or assessment depending on what you're uploading — see the table below.</w:t>
       </w:r>
     </w:p>
     <w:p>
@@ -392,7 +392,7 @@
                 <w:sz w:val="18"/>
                 <w:szCs w:val="18"/>
               </w:rPr>
-              <w:t xml:space="preserve">exams/</w:t>
+              <w:t xml:space="preserve">exam/</w:t>
             </w:r>
           </w:p>
         </w:tc>
@@ -423,7 +423,7 @@
                 <w:sz w:val="18"/>
                 <w:szCs w:val="18"/>
               </w:rPr>
-              <w:t xml:space="preserve">…/~username/exams/</w:t>
+              <w:t xml:space="preserve">…/~username/exam/</w:t>
             </w:r>
           </w:p>
         </w:tc>
@@ -442,7 +442,7 @@
                 <w:sz w:val="18"/>
                 <w:szCs w:val="18"/>
               </w:rPr>
-              <w:t xml:space="preserve">assessments/</w:t>
+              <w:t xml:space="preserve">assessment/</w:t>
             </w:r>
           </w:p>
         </w:tc>
@@ -473,7 +473,7 @@
                 <w:sz w:val="18"/>
                 <w:szCs w:val="18"/>
               </w:rPr>
-              <w:t xml:space="preserve">…/~username/assessments/</w:t>
+              <w:t xml:space="preserve">…/~username/assessment/</w:t>
             </w:r>
           </w:p>
         </w:tc>

</xml_diff>

<commit_message>
Update guides: upload straight into the assessment folder
</commit_message>
<xml_diff>
--- a/docs/Server_Access_Guide.docx
+++ b/docs/Server_Access_Guide.docx
@@ -81,7 +81,7 @@
         <w:t xml:space="preserve">https://&lt;server-address&gt;/register.php</w:t>
       </w:r>
       <w:r>
-        <w:t xml:space="preserve"> and enter your college email. Your tutor will give you the exact server address and the class enrolment password the page also asks for.</w:t>
+        <w:t xml:space="preserve"> and enter your college email. Your tutor will give you the exact server address.</w:t>
       </w:r>
     </w:p>
     <w:p>
@@ -120,7 +120,7 @@
         <w:spacing w:after="80"/>
       </w:pPr>
       <w:r>
-        <w:t xml:space="preserve">Already registered? Submitting the form again resets your password and re-sends it — use this if you've lost the original email. It does not delete any of your files.</w:t>
+        <w:t xml:space="preserve">Already registered? You can only register once. If you lost the email or forgot your password, ask your tutor — they can send it again.</w:t>
       </w:r>
     </w:p>
     <w:p>
@@ -136,7 +136,7 @@
         <w:t xml:space="preserve">Note: </w:t>
       </w:r>
       <w:r>
-        <w:t xml:space="preserve">Your username is generated from your email automatically (e.g. s1234567@heraldcollege.edu.np → s1234567) — you don't choose it yourself.</w:t>
+        <w:t xml:space="preserve">Your username is generated from your email automatically (e.g. sarayu.gautam@heraldcollege.edu.np → sarayu_gautam) — you don't choose it yourself.</w:t>
       </w:r>
     </w:p>
     <w:p>
@@ -217,7 +217,7 @@
           <w:sz w:val="20"/>
           <w:szCs w:val="20"/>
         </w:rPr>
-        <w:t xml:space="preserve">scp -r ./my-project &lt;username&gt;@&lt;server-address&gt;:~/workshops/</w:t>
+        <w:t xml:space="preserve">scp -r ./my-project/. &lt;username&gt;@&lt;server-address&gt;:~/assessment/</w:t>
       </w:r>
     </w:p>
     <w:p>
@@ -225,7 +225,7 @@
         <w:spacing w:after="160"/>
       </w:pPr>
       <w:r>
-        <w:t xml:space="preserve">That uploads a local folder called my-project into your workshops folder. Swap workshops for exam or assessment depending on what you're uploading — see the table below.</w:t>
+        <w:t xml:space="preserve">That copies the files inside my-project straight into your assessment folder, so your site opens at …/~username/assessment/. For workshops, upload one folder per week, for example: scp -r ./week1 &lt;username&gt;@&lt;server-address&gt;:~/workshops/ — it then opens at …/~username/workshops/week1/. Use ~/exam for the exam. See the table below.</w:t>
       </w:r>
     </w:p>
     <w:p>
@@ -514,7 +514,7 @@
         <w:spacing w:after="160"/>
       </w:pPr>
       <w:r>
-        <w:t xml:space="preserve">Every account gets its own MySQL/MariaDB database, named student_&lt;username&gt;, with the same username and password as SSH.</w:t>
+        <w:t xml:space="preserve">Every account gets its own MySQL/MariaDB database, with the same name as your username and the same password as SSH.</w:t>
       </w:r>
     </w:p>
     <w:p>
@@ -552,7 +552,7 @@
         <w:spacing w:after="80"/>
       </w:pPr>
       <w:r>
-        <w:t xml:space="preserve">First you'll be asked for the class enrolment username/password (the same one from step 1) — this just keeps random visitors off the login page.</w:t>
+        <w:t xml:space="preserve">First you'll be asked for a shared username and password — your tutor will give you these. It just keeps random visitors off the login page.</w:t>
       </w:r>
     </w:p>
     <w:p>

</xml_diff>

<commit_message>
Use SSH port 50222 in the student guide
SSH on this server is reached on port 50222, not 22, so the guide's ssh
and scp commands could not connect. They now give the port (-p 50222
for ssh, and -P 50222 for scp, which the guide points out), the
screenshots show the same commands, and the troubleshooting table says
to check the port first. The line suggesting WinSCP, FileZilla or
Cyberduck is gone, so students have one way to upload. The README's
student example uses the port too.

Co-Authored-By: Claude Opus 5.5 <noreply@anthropic.com>
Claude-Session: https://claude.ai/code/session_013bR1gBZC9XYizdKhzmoXVF
</commit_message>
<xml_diff>
--- a/docs/Server_Access_Guide.docx
+++ b/docs/Server_Access_Guide.docx
@@ -751,10 +751,10 @@
           <w:b w:val="false"/>
           <w:bCs w:val="false"/>
           <w:color w:val="1F1F1F"/>
-          <w:sz w:val="20"/>
-          <w:szCs w:val="20"/>
-        </w:rPr>
-        <w:t xml:space="preserve">ssh </w:t>
+          <w:sz w:val="18"/>
+          <w:szCs w:val="18"/>
+        </w:rPr>
+        <w:t xml:space="preserve">ssh -p 50222 </w:t>
       </w:r>
       <w:r>
         <w:rPr>
@@ -762,8 +762,8 @@
           <w:b/>
           <w:bCs/>
           <w:color w:val="1F1F1F"/>
-          <w:sz w:val="20"/>
-          <w:szCs w:val="20"/>
+          <w:sz w:val="18"/>
+          <w:szCs w:val="18"/>
         </w:rPr>
         <w:t xml:space="preserve">student_username</w:t>
       </w:r>
@@ -773,8 +773,8 @@
           <w:b w:val="false"/>
           <w:bCs w:val="false"/>
           <w:color w:val="1F1F1F"/>
-          <w:sz w:val="20"/>
-          <w:szCs w:val="20"/>
+          <w:sz w:val="18"/>
+          <w:szCs w:val="18"/>
         </w:rPr>
         <w:t xml:space="preserve">@fullstack.heraldcollege.edu.np</w:t>
       </w:r>
@@ -787,9 +787,9 @@
       <w:r>
         <w:drawing>
           <wp:inline distT="0" distB="0" distL="0" distR="0">
-            <wp:extent cx="6038850" cy="2000250"/>
+            <wp:extent cx="6038850" cy="1838325"/>
             <wp:effectExtent t="0" r="0" b="0" l="0"/>
-            <wp:docPr id="1" name="term-ssh.png" descr="PowerShell: the ssh command, yes to the first-time question, the password prompt, then the server prompt student_username@fullstack, ls showing assessment, exam and workshops, and exit" title="PowerShell: the ssh command, yes to the first-time question, the password prompt, then the server prompt student_username@fullstack, ls showing assessment, exam and workshops, and exit"/>
+            <wp:docPr id="1" name="term-ssh.png" descr="PowerShell: the ssh command with -p 50222, yes to the first-time question, the password prompt, then the server prompt student_username@fullstack, ls showing assessment, exam and workshops, and exit" title="PowerShell: the ssh command with -p 50222, yes to the first-time question, the password prompt, then the server prompt student_username@fullstack, ls showing assessment, exam and workshops, and exit"/>
             <wp:cNvGraphicFramePr>
               <a:graphicFrameLocks xmlns:a="http://schemas.openxmlformats.org/drawingml/2006/main" noChangeAspect="1"/>
             </wp:cNvGraphicFramePr>
@@ -812,7 +812,7 @@
                   <pic:spPr bwMode="auto">
                     <a:xfrm>
                       <a:off x="0" y="0"/>
-                      <a:ext cx="6038850" cy="2000250"/>
+                      <a:ext cx="6038850" cy="1838325"/>
                     </a:xfrm>
                     <a:prstGeom prst="rect">
                       <a:avLst/>
@@ -940,7 +940,17 @@
         <w:t xml:space="preserve">cd</w:t>
       </w:r>
       <w:r>
-        <w:t xml:space="preserve"> and a space in Terminal, drag the folder in and press Enter.</w:t>
+        <w:t xml:space="preserve"> and a space in Terminal, drag the folder in and press Enter. Note that scp takes the port with a capital </w:t>
+      </w:r>
+      <w:r>
+        <w:rPr>
+          <w:b/>
+          <w:bCs/>
+        </w:rPr>
+        <w:t xml:space="preserve">-P</w:t>
+      </w:r>
+      <w:r>
+        <w:t xml:space="preserve">.</w:t>
       </w:r>
     </w:p>
     <w:p>
@@ -975,10 +985,10 @@
           <w:b w:val="false"/>
           <w:bCs w:val="false"/>
           <w:color w:val="1F1F1F"/>
-          <w:sz w:val="20"/>
-          <w:szCs w:val="20"/>
-        </w:rPr>
-        <w:t xml:space="preserve">scp -r week1 </w:t>
+          <w:sz w:val="18"/>
+          <w:szCs w:val="18"/>
+        </w:rPr>
+        <w:t xml:space="preserve">scp -P 50222 -r week1 </w:t>
       </w:r>
       <w:r>
         <w:rPr>
@@ -986,8 +996,8 @@
           <w:b/>
           <w:bCs/>
           <w:color w:val="1F1F1F"/>
-          <w:sz w:val="20"/>
-          <w:szCs w:val="20"/>
+          <w:sz w:val="18"/>
+          <w:szCs w:val="18"/>
         </w:rPr>
         <w:t xml:space="preserve">student_username</w:t>
       </w:r>
@@ -997,8 +1007,8 @@
           <w:b w:val="false"/>
           <w:bCs w:val="false"/>
           <w:color w:val="1F1F1F"/>
-          <w:sz w:val="20"/>
-          <w:szCs w:val="20"/>
+          <w:sz w:val="18"/>
+          <w:szCs w:val="18"/>
         </w:rPr>
         <w:t xml:space="preserve">@fullstack.heraldcollege.edu.np:~/workshops/</w:t>
       </w:r>
@@ -1011,9 +1021,9 @@
       <w:r>
         <w:drawing>
           <wp:inline distT="0" distB="0" distL="0" distR="0">
-            <wp:extent cx="6038850" cy="952500"/>
+            <wp:extent cx="6038850" cy="876300"/>
             <wp:effectExtent t="0" r="0" b="0" l="0"/>
-            <wp:docPr id="1" name="term-scp.png" descr="PowerShell in Documents: the scp command, the password prompt, then index.php and style.css uploaded at 100%" title="PowerShell in Documents: the scp command, the password prompt, then index.php and style.css uploaded at 100%"/>
+            <wp:docPr id="1" name="term-scp.png" descr="PowerShell in Documents: the scp command with -P 50222, the password prompt, then index.php and style.css uploaded at 100%" title="PowerShell in Documents: the scp command with -P 50222, the password prompt, then index.php and style.css uploaded at 100%"/>
             <wp:cNvGraphicFramePr>
               <a:graphicFrameLocks xmlns:a="http://schemas.openxmlformats.org/drawingml/2006/main" noChangeAspect="1"/>
             </wp:cNvGraphicFramePr>
@@ -1036,7 +1046,7 @@
                   <pic:spPr bwMode="auto">
                     <a:xfrm>
                       <a:off x="0" y="0"/>
-                      <a:ext cx="6038850" cy="952500"/>
+                      <a:ext cx="6038850" cy="876300"/>
                     </a:xfrm>
                     <a:prstGeom prst="rect">
                       <a:avLst/>
@@ -1126,10 +1136,10 @@
           <w:b w:val="false"/>
           <w:bCs w:val="false"/>
           <w:color w:val="1F1F1F"/>
-          <w:sz w:val="20"/>
-          <w:szCs w:val="20"/>
-        </w:rPr>
-        <w:t xml:space="preserve">scp -r assessment </w:t>
+          <w:sz w:val="18"/>
+          <w:szCs w:val="18"/>
+        </w:rPr>
+        <w:t xml:space="preserve">scp -P 50222 -r assessment </w:t>
       </w:r>
       <w:r>
         <w:rPr>
@@ -1137,8 +1147,8 @@
           <w:b/>
           <w:bCs/>
           <w:color w:val="1F1F1F"/>
-          <w:sz w:val="20"/>
-          <w:szCs w:val="20"/>
+          <w:sz w:val="18"/>
+          <w:szCs w:val="18"/>
         </w:rPr>
         <w:t xml:space="preserve">student_username</w:t>
       </w:r>
@@ -1148,8 +1158,8 @@
           <w:b w:val="false"/>
           <w:bCs w:val="false"/>
           <w:color w:val="1F1F1F"/>
-          <w:sz w:val="20"/>
-          <w:szCs w:val="20"/>
+          <w:sz w:val="18"/>
+          <w:szCs w:val="18"/>
         </w:rPr>
         <w:t xml:space="preserve">@fullstack.heraldcollege.edu.np:~/</w:t>
       </w:r>
@@ -1169,48 +1179,6 @@
       </w:r>
       <w:r>
         <w:t xml:space="preserve">.</w:t>
-      </w:r>
-    </w:p>
-    <w:p>
-      <w:r>
-        <w:rPr>
-          <w:b/>
-          <w:bCs/>
-        </w:rPr>
-        <w:t xml:space="preserve">Prefer drag and drop?</w:t>
-      </w:r>
-      <w:r>
-        <w:t xml:space="preserve"> Use WinSCP, FileZilla or Cyberduck with protocol </w:t>
-      </w:r>
-      <w:r>
-        <w:rPr>
-          <w:b/>
-          <w:bCs/>
-        </w:rPr>
-        <w:t xml:space="preserve">SFTP</w:t>
-      </w:r>
-      <w:r>
-        <w:t xml:space="preserve">, port </w:t>
-      </w:r>
-      <w:r>
-        <w:rPr>
-          <w:b/>
-          <w:bCs/>
-        </w:rPr>
-        <w:t xml:space="preserve">22</w:t>
-      </w:r>
-      <w:r>
-        <w:t xml:space="preserve">, host </w:t>
-      </w:r>
-      <w:r>
-        <w:rPr>
-          <w:b/>
-          <w:bCs/>
-        </w:rPr>
-        <w:t xml:space="preserve">fullstack.heraldcollege.edu.np</w:t>
-      </w:r>
-      <w:r>
-        <w:t xml:space="preserve"> and your username and password.</w:t>
       </w:r>
     </w:p>
     <w:p>
@@ -1333,8 +1301,8 @@
           <w:b w:val="false"/>
           <w:bCs w:val="false"/>
           <w:color w:val="1F1F1F"/>
-          <w:sz w:val="20"/>
-          <w:szCs w:val="20"/>
+          <w:sz w:val="18"/>
+          <w:szCs w:val="18"/>
         </w:rPr>
         <w:t xml:space="preserve">&lt;?php</w:t>
       </w:r>
@@ -1359,8 +1327,8 @@
           <w:b w:val="false"/>
           <w:bCs w:val="false"/>
           <w:color w:val="1F1F1F"/>
-          <w:sz w:val="20"/>
-          <w:szCs w:val="20"/>
+          <w:sz w:val="18"/>
+          <w:szCs w:val="18"/>
         </w:rPr>
         <w:t xml:space="preserve">$pdo = new PDO(</w:t>
       </w:r>
@@ -1385,8 +1353,8 @@
           <w:b w:val="false"/>
           <w:bCs w:val="false"/>
           <w:color w:val="1F1F1F"/>
-          <w:sz w:val="20"/>
-          <w:szCs w:val="20"/>
+          <w:sz w:val="18"/>
+          <w:szCs w:val="18"/>
         </w:rPr>
         <w:t xml:space="preserve">    </w:t>
       </w:r>
@@ -1396,8 +1364,8 @@
           <w:b w:val="false"/>
           <w:bCs w:val="false"/>
           <w:color w:val="347020"/>
-          <w:sz w:val="20"/>
-          <w:szCs w:val="20"/>
+          <w:sz w:val="18"/>
+          <w:szCs w:val="18"/>
         </w:rPr>
         <w:t xml:space="preserve">'mysql:host=localhost;dbname=</w:t>
       </w:r>
@@ -1407,8 +1375,8 @@
           <w:b/>
           <w:bCs/>
           <w:color w:val="1F1F1F"/>
-          <w:sz w:val="20"/>
-          <w:szCs w:val="20"/>
+          <w:sz w:val="18"/>
+          <w:szCs w:val="18"/>
         </w:rPr>
         <w:t xml:space="preserve">student_username</w:t>
       </w:r>
@@ -1418,8 +1386,8 @@
           <w:b w:val="false"/>
           <w:bCs w:val="false"/>
           <w:color w:val="347020"/>
-          <w:sz w:val="20"/>
-          <w:szCs w:val="20"/>
+          <w:sz w:val="18"/>
+          <w:szCs w:val="18"/>
         </w:rPr>
         <w:t xml:space="preserve">;charset=utf8mb4'</w:t>
       </w:r>
@@ -1429,8 +1397,8 @@
           <w:b w:val="false"/>
           <w:bCs w:val="false"/>
           <w:color w:val="1F1F1F"/>
-          <w:sz w:val="20"/>
-          <w:szCs w:val="20"/>
+          <w:sz w:val="18"/>
+          <w:szCs w:val="18"/>
         </w:rPr>
         <w:t xml:space="preserve">,</w:t>
       </w:r>
@@ -1455,8 +1423,8 @@
           <w:b w:val="false"/>
           <w:bCs w:val="false"/>
           <w:color w:val="1F1F1F"/>
-          <w:sz w:val="20"/>
-          <w:szCs w:val="20"/>
+          <w:sz w:val="18"/>
+          <w:szCs w:val="18"/>
         </w:rPr>
         <w:t xml:space="preserve">    </w:t>
       </w:r>
@@ -1466,8 +1434,8 @@
           <w:b w:val="false"/>
           <w:bCs w:val="false"/>
           <w:color w:val="347020"/>
-          <w:sz w:val="20"/>
-          <w:szCs w:val="20"/>
+          <w:sz w:val="18"/>
+          <w:szCs w:val="18"/>
         </w:rPr>
         <w:t xml:space="preserve">'</w:t>
       </w:r>
@@ -1477,8 +1445,8 @@
           <w:b/>
           <w:bCs/>
           <w:color w:val="1F1F1F"/>
-          <w:sz w:val="20"/>
-          <w:szCs w:val="20"/>
+          <w:sz w:val="18"/>
+          <w:szCs w:val="18"/>
         </w:rPr>
         <w:t xml:space="preserve">student_username</w:t>
       </w:r>
@@ -1488,8 +1456,8 @@
           <w:b w:val="false"/>
           <w:bCs w:val="false"/>
           <w:color w:val="347020"/>
-          <w:sz w:val="20"/>
-          <w:szCs w:val="20"/>
+          <w:sz w:val="18"/>
+          <w:szCs w:val="18"/>
         </w:rPr>
         <w:t xml:space="preserve">'</w:t>
       </w:r>
@@ -1499,8 +1467,8 @@
           <w:b w:val="false"/>
           <w:bCs w:val="false"/>
           <w:color w:val="1F1F1F"/>
-          <w:sz w:val="20"/>
-          <w:szCs w:val="20"/>
+          <w:sz w:val="18"/>
+          <w:szCs w:val="18"/>
         </w:rPr>
         <w:t xml:space="preserve">,</w:t>
       </w:r>
@@ -1525,8 +1493,8 @@
           <w:b w:val="false"/>
           <w:bCs w:val="false"/>
           <w:color w:val="1F1F1F"/>
-          <w:sz w:val="20"/>
-          <w:szCs w:val="20"/>
+          <w:sz w:val="18"/>
+          <w:szCs w:val="18"/>
         </w:rPr>
         <w:t xml:space="preserve">    </w:t>
       </w:r>
@@ -1536,8 +1504,8 @@
           <w:b w:val="false"/>
           <w:bCs w:val="false"/>
           <w:color w:val="347020"/>
-          <w:sz w:val="20"/>
-          <w:szCs w:val="20"/>
+          <w:sz w:val="18"/>
+          <w:szCs w:val="18"/>
         </w:rPr>
         <w:t xml:space="preserve">'your-password'</w:t>
       </w:r>
@@ -1562,8 +1530,8 @@
           <w:b w:val="false"/>
           <w:bCs w:val="false"/>
           <w:color w:val="1F1F1F"/>
-          <w:sz w:val="20"/>
-          <w:szCs w:val="20"/>
+          <w:sz w:val="18"/>
+          <w:szCs w:val="18"/>
         </w:rPr>
         <w:t xml:space="preserve">);</w:t>
       </w:r>
@@ -1616,8 +1584,8 @@
           <w:b w:val="false"/>
           <w:bCs w:val="false"/>
           <w:color w:val="1F1F1F"/>
-          <w:sz w:val="20"/>
-          <w:szCs w:val="20"/>
+          <w:sz w:val="18"/>
+          <w:szCs w:val="18"/>
         </w:rPr>
         <w:t xml:space="preserve">mysql -u </w:t>
       </w:r>
@@ -1627,8 +1595,8 @@
           <w:b/>
           <w:bCs/>
           <w:color w:val="1F1F1F"/>
-          <w:sz w:val="20"/>
-          <w:szCs w:val="20"/>
+          <w:sz w:val="18"/>
+          <w:szCs w:val="18"/>
         </w:rPr>
         <w:t xml:space="preserve">student_username</w:t>
       </w:r>
@@ -1638,8 +1606,8 @@
           <w:b w:val="false"/>
           <w:bCs w:val="false"/>
           <w:color w:val="1F1F1F"/>
-          <w:sz w:val="20"/>
-          <w:szCs w:val="20"/>
+          <w:sz w:val="18"/>
+          <w:szCs w:val="18"/>
         </w:rPr>
         <w:t xml:space="preserve"> -p </w:t>
       </w:r>
@@ -1649,8 +1617,8 @@
           <w:b/>
           <w:bCs/>
           <w:color w:val="1F1F1F"/>
-          <w:sz w:val="20"/>
-          <w:szCs w:val="20"/>
+          <w:sz w:val="18"/>
+          <w:szCs w:val="18"/>
         </w:rPr>
         <w:t xml:space="preserve">student_username</w:t>
       </w:r>
@@ -1660,8 +1628,8 @@
           <w:b w:val="false"/>
           <w:bCs w:val="false"/>
           <w:color w:val="1F1F1F"/>
-          <w:sz w:val="20"/>
-          <w:szCs w:val="20"/>
+          <w:sz w:val="18"/>
+          <w:szCs w:val="18"/>
         </w:rPr>
         <w:t xml:space="preserve"> &lt; schema.sql</w:t>
       </w:r>
@@ -1727,8 +1695,8 @@
           <w:b w:val="false"/>
           <w:bCs w:val="false"/>
           <w:color w:val="1F1F1F"/>
-          <w:sz w:val="20"/>
-          <w:szCs w:val="20"/>
+          <w:sz w:val="18"/>
+          <w:szCs w:val="18"/>
         </w:rPr>
         <w:t xml:space="preserve">composer require jenssegers/blade</w:t>
       </w:r>
@@ -2189,7 +2157,7 @@
               <w:spacing w:after="0" w:line="360" w:lineRule="auto"/>
             </w:pPr>
             <w:r>
-              <w:t xml:space="preserve">Use 10.80.0.250 in place of the server's name (the part ending in heraldcollege.edu.np). If that also fails, your computer may be blocked: ask your tutor.</w:t>
+              <w:t xml:space="preserve">Check that ssh and scp commands include 50222. If they do, use 10.80.0.250 in place of the server's name (the part ending in heraldcollege.edu.np). If that also fails, your computer may be blocked: ask your tutor.</w:t>
             </w:r>
           </w:p>
         </w:tc>

</xml_diff>